<commit_message>
docs: Update docs to new PBI
</commit_message>
<xml_diff>
--- a/normas/NORMA_220501096_Desarrollo_KL.docx
+++ b/normas/NORMA_220501096_Desarrollo_KL.docx
@@ -68,8 +68,8 @@
         <w:tblLook w:val="04A0" w:firstRow="1" w:lastRow="0" w:firstColumn="1" w:lastColumn="0" w:noHBand="0" w:noVBand="1"/>
       </w:tblPr>
       <w:tblGrid>
-        <w:gridCol w:w="4561"/>
-        <w:gridCol w:w="4561"/>
+        <w:gridCol w:w="4556"/>
+        <w:gridCol w:w="4556"/>
       </w:tblGrid>
       <w:tr>
         <w:tc>
@@ -150,7 +150,15 @@
                 <w:color w:val="FFFFFF"/>
                 <w:sz w:val="20"/>
               </w:rPr>
-              <w:t>Ruta Riwi:</w:t>
+              <w:t xml:space="preserve">Ruta </w:t>
+            </w:r>
+            <w:r>
+              <w:rPr>
+                <w:b/>
+                <w:color w:val="FFFFFF"/>
+                <w:sz w:val="20"/>
+              </w:rPr>
+              <w:t>Riwi:</w:t>
             </w:r>
           </w:p>
         </w:tc>
@@ -349,7 +357,7 @@
           <w:sz w:val="18"/>
         </w:rPr>
         <w:br/>
-        <w:t>├── Datos.csv                   # Dataset original (2,000,000 filas)</w:t>
+        <w:t xml:space="preserve">├── Datos.csv                   # </w:t>
       </w:r>
       <w:r>
         <w:rPr>
@@ -357,8 +365,7 @@
           <w:color w:val="1B5E20"/>
           <w:sz w:val="18"/>
         </w:rPr>
-        <w:br/>
-        <w:t>├── Datos_limpio.csv            # Dataset limpio (1,951,391 filas)</w:t>
+        <w:t>Dataset original (2,000,000 filas)</w:t>
       </w:r>
       <w:r>
         <w:rPr>
@@ -367,7 +374,7 @@
           <w:sz w:val="18"/>
         </w:rPr>
         <w:br/>
-        <w:t>├── limpieza.py                 # Pipeline ETL — 15 pasos documentados</w:t>
+        <w:t>├── Datos_limpio.csv            # Dataset limpio (1,951,391 filas)</w:t>
       </w:r>
       <w:r>
         <w:rPr>
@@ -376,7 +383,7 @@
           <w:sz w:val="18"/>
         </w:rPr>
         <w:br/>
-        <w:t>├── conexion_carga_datos.py     # Carga a PostgreSQL (modelo estrella)</w:t>
+        <w:t>├── limpieza.py                 # Pipeline ETL — 15 pasos documentados</w:t>
       </w:r>
       <w:r>
         <w:rPr>
@@ -385,7 +392,7 @@
           <w:sz w:val="18"/>
         </w:rPr>
         <w:br/>
-        <w:t>├── bbdd.sql                    # DDL + consultas SQL analíticas</w:t>
+        <w:t>├── conexion_carga_datos.py     # Carga a PostgreSQL (modelo estrella)</w:t>
       </w:r>
       <w:r>
         <w:rPr>
@@ -394,7 +401,7 @@
           <w:sz w:val="18"/>
         </w:rPr>
         <w:br/>
-        <w:t>├── requirements.txt            # Dependencias Python</w:t>
+        <w:t>├── bbdd.sql                    # DDL + consultas SQL analíticas</w:t>
       </w:r>
       <w:r>
         <w:rPr>
@@ -403,7 +410,7 @@
           <w:sz w:val="18"/>
         </w:rPr>
         <w:br/>
-        <w:t>├── .env                        # DATABASE_URL (fuera del código)</w:t>
+        <w:t>├── requirements.txt            # Dependencias Python</w:t>
       </w:r>
       <w:r>
         <w:rPr>
@@ -412,7 +419,7 @@
           <w:sz w:val="18"/>
         </w:rPr>
         <w:br/>
-        <w:t>├── portal/</w:t>
+        <w:t>├── .env                        # DATABASE_URL (fuera del código)</w:t>
       </w:r>
       <w:r>
         <w:rPr>
@@ -421,7 +428,7 @@
           <w:sz w:val="18"/>
         </w:rPr>
         <w:br/>
-        <w:t>│   ├── index.html              # Portal web con Chart.js</w:t>
+        <w:t>├── portal/</w:t>
       </w:r>
       <w:r>
         <w:rPr>
@@ -430,7 +437,24 @@
           <w:sz w:val="18"/>
         </w:rPr>
         <w:br/>
-        <w:t>│   └── styles.css</w:t>
+        <w:t>│   ├── index.html              # Portal web con Chart.js</w:t>
+      </w:r>
+      <w:r>
+        <w:rPr>
+          <w:rFonts w:ascii="Courier New" w:hAnsi="Courier New"/>
+          <w:color w:val="1B5E20"/>
+          <w:sz w:val="18"/>
+        </w:rPr>
+        <w:br/>
+        <w:t>│   └── style</w:t>
+      </w:r>
+      <w:r>
+        <w:rPr>
+          <w:rFonts w:ascii="Courier New" w:hAnsi="Courier New"/>
+          <w:color w:val="1B5E20"/>
+          <w:sz w:val="18"/>
+        </w:rPr>
+        <w:t>s.css</w:t>
       </w:r>
       <w:r>
         <w:rPr>
@@ -493,7 +517,25 @@
           <w:sz w:val="18"/>
         </w:rPr>
         <w:br/>
-        <w:t xml:space="preserve">                                                              Power BI  /  portal/index.html</w:t>
+        <w:t xml:space="preserve">                                                              Power </w:t>
+      </w:r>
+      <w:proofErr w:type="gramStart"/>
+      <w:r>
+        <w:rPr>
+          <w:rFonts w:ascii="Courier New" w:hAnsi="Courier New"/>
+          <w:color w:val="1B5E20"/>
+          <w:sz w:val="18"/>
+        </w:rPr>
+        <w:t>BI  /</w:t>
+      </w:r>
+      <w:proofErr w:type="gramEnd"/>
+      <w:r>
+        <w:rPr>
+          <w:rFonts w:ascii="Courier New" w:hAnsi="Courier New"/>
+          <w:color w:val="1B5E20"/>
+          <w:sz w:val="18"/>
+        </w:rPr>
+        <w:t xml:space="preserve">  portal/index.html</w:t>
       </w:r>
     </w:p>
     <w:p>
@@ -559,25 +601,25 @@
           <w:sz w:val="18"/>
         </w:rPr>
         <w:br/>
-        <w:t xml:space="preserve">    if pd.isna(valor):</w:t>
-      </w:r>
+        <w:t xml:space="preserve">    if </w:t>
+      </w:r>
+      <w:proofErr w:type="gramStart"/>
       <w:r>
         <w:rPr>
           <w:rFonts w:ascii="Courier New" w:hAnsi="Courier New"/>
           <w:color w:val="1B5E20"/>
           <w:sz w:val="18"/>
         </w:rPr>
-        <w:br/>
-        <w:t xml:space="preserve">        return valor                     # Preserva NaN para manejo posterior</w:t>
-      </w:r>
+        <w:t>pd.isna</w:t>
+      </w:r>
+      <w:proofErr w:type="gramEnd"/>
       <w:r>
         <w:rPr>
           <w:rFonts w:ascii="Courier New" w:hAnsi="Courier New"/>
           <w:color w:val="1B5E20"/>
           <w:sz w:val="18"/>
         </w:rPr>
-        <w:br/>
-        <w:t xml:space="preserve">    if isinstance(valor, str):</w:t>
+        <w:t>(valor):</w:t>
       </w:r>
       <w:r>
         <w:rPr>
@@ -586,7 +628,7 @@
           <w:sz w:val="18"/>
         </w:rPr>
         <w:br/>
-        <w:t xml:space="preserve">        valor = re.sub(r'[@#*$%^&amp;(){}[]&lt;&gt;~`]', '', valor)</w:t>
+        <w:t xml:space="preserve">        return valor                     # Preserva NaN para manejo posterior</w:t>
       </w:r>
       <w:r>
         <w:rPr>
@@ -595,7 +637,7 @@
           <w:sz w:val="18"/>
         </w:rPr>
         <w:br/>
-        <w:t xml:space="preserve">        valor = re.sub(r'\s+', ' ', valor)  # Colapsa espacios múltiples</w:t>
+        <w:t xml:space="preserve">    if isinstance(valor, str):</w:t>
       </w:r>
       <w:r>
         <w:rPr>
@@ -604,7 +646,7 @@
           <w:sz w:val="18"/>
         </w:rPr>
         <w:br/>
-        <w:t xml:space="preserve">        return valor.strip()</w:t>
+        <w:t xml:space="preserve">        valor = re.sub(r'[@#*$%^&amp;(){}[]&lt;&gt;~`]', '', valor)</w:t>
       </w:r>
       <w:r>
         <w:rPr>
@@ -613,7 +655,7 @@
           <w:sz w:val="18"/>
         </w:rPr>
         <w:br/>
-        <w:t xml:space="preserve">    return valor</w:t>
+        <w:t xml:space="preserve">        valor = re.sub(r'\s+', ' ', valor)  # Colapsa espacios múltiples</w:t>
       </w:r>
       <w:r>
         <w:rPr>
@@ -622,6 +664,7 @@
           <w:sz w:val="18"/>
         </w:rPr>
         <w:br/>
+        <w:t xml:space="preserve">        return valor.strip()</w:t>
       </w:r>
       <w:r>
         <w:rPr>
@@ -630,7 +673,7 @@
           <w:sz w:val="18"/>
         </w:rPr>
         <w:br/>
-        <w:t># 5. CORRECCIONES ORTOGRÁFICAS</w:t>
+        <w:t xml:space="preserve">    return valor</w:t>
       </w:r>
       <w:r>
         <w:rPr>
@@ -639,7 +682,6 @@
           <w:sz w:val="18"/>
         </w:rPr>
         <w:br/>
-        <w:t># Mapeo: versión incorrecta → versión canónica del producto</w:t>
       </w:r>
       <w:r>
         <w:rPr>
@@ -648,7 +690,7 @@
           <w:sz w:val="18"/>
         </w:rPr>
         <w:br/>
-        <w:t>correcciones_producto = {</w:t>
+        <w:t># 5. CORRECCIONES ORTOGRÁFICAS</w:t>
       </w:r>
       <w:r>
         <w:rPr>
@@ -657,7 +699,51 @@
           <w:sz w:val="18"/>
         </w:rPr>
         <w:br/>
-        <w:t xml:space="preserve">    'Yogur': 'Yogurt',  'Yogurth': 'Yogurt',  'Gasosa': 'Gaseosa',</w:t>
+        <w:t># Mapeo: versión incorrecta → versión canónica del producto</w:t>
+      </w:r>
+      <w:r>
+        <w:rPr>
+          <w:rFonts w:ascii="Courier New" w:hAnsi="Courier New"/>
+          <w:color w:val="1B5E20"/>
+          <w:sz w:val="18"/>
+        </w:rPr>
+        <w:br/>
+        <w:t>correcci</w:t>
+      </w:r>
+      <w:r>
+        <w:rPr>
+          <w:rFonts w:ascii="Courier New" w:hAnsi="Courier New"/>
+          <w:color w:val="1B5E20"/>
+          <w:sz w:val="18"/>
+        </w:rPr>
+        <w:t>ones_producto = {</w:t>
+      </w:r>
+      <w:r>
+        <w:rPr>
+          <w:rFonts w:ascii="Courier New" w:hAnsi="Courier New"/>
+          <w:color w:val="1B5E20"/>
+          <w:sz w:val="18"/>
+        </w:rPr>
+        <w:br/>
+        <w:t xml:space="preserve">    'Yogur': 'Yogurt</w:t>
+      </w:r>
+      <w:proofErr w:type="gramStart"/>
+      <w:r>
+        <w:rPr>
+          <w:rFonts w:ascii="Courier New" w:hAnsi="Courier New"/>
+          <w:color w:val="1B5E20"/>
+          <w:sz w:val="18"/>
+        </w:rPr>
+        <w:t>',  '</w:t>
+      </w:r>
+      <w:proofErr w:type="gramEnd"/>
+      <w:r>
+        <w:rPr>
+          <w:rFonts w:ascii="Courier New" w:hAnsi="Courier New"/>
+          <w:color w:val="1B5E20"/>
+          <w:sz w:val="18"/>
+        </w:rPr>
+        <w:t>Yogurth': 'Yogurt',  'Gasosa': 'Gaseosa',</w:t>
       </w:r>
       <w:r>
         <w:rPr>
@@ -834,7 +920,15 @@
           <w:sz w:val="18"/>
         </w:rPr>
         <w:br/>
-        <w:t xml:space="preserve">    # .map() aplica el diccionario; .fillna() preserva valores para productos</w:t>
+        <w:t xml:space="preserve">    # .map() aplica el diccionario; .fillna() preserva valores pa</w:t>
+      </w:r>
+      <w:r>
+        <w:rPr>
+          <w:rFonts w:ascii="Courier New" w:hAnsi="Courier New"/>
+          <w:color w:val="1B5E20"/>
+          <w:sz w:val="18"/>
+        </w:rPr>
+        <w:t>ra productos</w:t>
       </w:r>
       <w:r>
         <w:rPr>
@@ -909,7 +1003,7 @@
           <w:sz w:val="18"/>
         </w:rPr>
         <w:br/>
-        <w:t>with engine.begin() as conn:</w:t>
+        <w:t xml:space="preserve">with </w:t>
       </w:r>
       <w:r>
         <w:rPr>
@@ -917,7 +1011,7 @@
           <w:color w:val="1B5E20"/>
           <w:sz w:val="18"/>
         </w:rPr>
-        <w:br/>
+        <w:t>engine.begin() as conn:</w:t>
       </w:r>
       <w:r>
         <w:rPr>
@@ -926,7 +1020,6 @@
           <w:sz w:val="18"/>
         </w:rPr>
         <w:br/>
-        <w:t xml:space="preserve">    # DIM_REGION — inserta pares únicos ciudad/país</w:t>
       </w:r>
       <w:r>
         <w:rPr>
@@ -935,7 +1028,7 @@
           <w:sz w:val="18"/>
         </w:rPr>
         <w:br/>
-        <w:t xml:space="preserve">    regiones = df[['ciudad', 'pais']].drop_duplicates()</w:t>
+        <w:t xml:space="preserve">    # DIM_REGION — inserta pares únicos ciudad/país</w:t>
       </w:r>
       <w:r>
         <w:rPr>
@@ -944,7 +1037,7 @@
           <w:sz w:val="18"/>
         </w:rPr>
         <w:br/>
-        <w:t xml:space="preserve">    conn.execute(text("""</w:t>
+        <w:t xml:space="preserve">    regiones = df[['ciudad', 'pais']].drop_duplicates()</w:t>
       </w:r>
       <w:r>
         <w:rPr>
@@ -953,7 +1046,7 @@
           <w:sz w:val="18"/>
         </w:rPr>
         <w:br/>
-        <w:t xml:space="preserve">        INSERT INTO dim_region (ciudad, pais) VALUES (:ciudad, :pais)</w:t>
+        <w:t xml:space="preserve">    conn.execute(text("""</w:t>
       </w:r>
       <w:r>
         <w:rPr>
@@ -962,7 +1055,7 @@
           <w:sz w:val="18"/>
         </w:rPr>
         <w:br/>
-        <w:t xml:space="preserve">        ON CONFLICT (ciudad, pais) DO NOTHING  -- Idempotente</w:t>
+        <w:t xml:space="preserve">        INSERT INTO dim_region (ciudad, pais) VALUES (:ciudad, :pais)</w:t>
       </w:r>
       <w:r>
         <w:rPr>
@@ -971,7 +1064,7 @@
           <w:sz w:val="18"/>
         </w:rPr>
         <w:br/>
-        <w:t xml:space="preserve">    """), regiones.to_dict(orient='records'))</w:t>
+        <w:t xml:space="preserve">        ON CONFLICT (ciudad, pais) DO NOTHING  -- Idempotente</w:t>
       </w:r>
       <w:r>
         <w:rPr>
@@ -980,6 +1073,7 @@
           <w:sz w:val="18"/>
         </w:rPr>
         <w:br/>
+        <w:t xml:space="preserve">    """), regiones.to_dict(orient='records'))</w:t>
       </w:r>
       <w:r>
         <w:rPr>
@@ -988,7 +1082,6 @@
           <w:sz w:val="18"/>
         </w:rPr>
         <w:br/>
-        <w:t xml:space="preserve">    # Recupera IDs generados para el JOIN con fact_ventas</w:t>
       </w:r>
       <w:r>
         <w:rPr>
@@ -997,7 +1090,7 @@
           <w:sz w:val="18"/>
         </w:rPr>
         <w:br/>
-        <w:t xml:space="preserve">    region_map = pd.read_sql('SELECT id_region, ciudad, pais FROM dim_region', conn)</w:t>
+        <w:t xml:space="preserve">    # Recupera IDs generados para el JOIN con fact_ventas</w:t>
       </w:r>
       <w:r>
         <w:rPr>
@@ -1006,7 +1099,7 @@
           <w:sz w:val="18"/>
         </w:rPr>
         <w:br/>
-        <w:t xml:space="preserve">    df = df.merge(region_map, on=['ciudad', 'pais'], how='left')</w:t>
+        <w:t xml:space="preserve">    region_map = pd.read_sql('SELECT id_region, ciudad, pais FROM dim_region', conn)</w:t>
       </w:r>
       <w:r>
         <w:rPr>
@@ -1015,6 +1108,7 @@
           <w:sz w:val="18"/>
         </w:rPr>
         <w:br/>
+        <w:t xml:space="preserve">    df = df.merge(region_map, o</w:t>
       </w:r>
       <w:r>
         <w:rPr>
@@ -1022,8 +1116,7 @@
           <w:color w:val="1B5E20"/>
           <w:sz w:val="18"/>
         </w:rPr>
-        <w:br/>
-        <w:t xml:space="preserve">    # FACT_VENTAS — carga solo filas con todas las FK presentes</w:t>
+        <w:t>n=['ciudad', 'pais'], how='left')</w:t>
       </w:r>
       <w:r>
         <w:rPr>
@@ -1032,7 +1125,6 @@
           <w:sz w:val="18"/>
         </w:rPr>
         <w:br/>
-        <w:t xml:space="preserve">    fact = df[['id_fecha','id_producto','id_cliente',</w:t>
       </w:r>
       <w:r>
         <w:rPr>
@@ -1041,7 +1133,7 @@
           <w:sz w:val="18"/>
         </w:rPr>
         <w:br/>
-        <w:t xml:space="preserve">               'cantidad','precio_unitario','descuento','costo_envio','total']].dropna()</w:t>
+        <w:t xml:space="preserve">    # FACT_VENTAS — carga solo filas con todas las FK presentes</w:t>
       </w:r>
       <w:r>
         <w:rPr>
@@ -1050,7 +1142,7 @@
           <w:sz w:val="18"/>
         </w:rPr>
         <w:br/>
-        <w:t xml:space="preserve">    conn.execute(text("""</w:t>
+        <w:t xml:space="preserve">    fact = df[['id_fecha','id_producto','id_cliente',</w:t>
       </w:r>
       <w:r>
         <w:rPr>
@@ -1059,7 +1151,7 @@
           <w:sz w:val="18"/>
         </w:rPr>
         <w:br/>
-        <w:t xml:space="preserve">        INSERT INTO fact_ventas (id_fecha, id_producto, id_cliente,</w:t>
+        <w:t xml:space="preserve">               'cantidad','precio_unitario','descuento','costo_envio','total']].dropna()</w:t>
       </w:r>
       <w:r>
         <w:rPr>
@@ -1068,7 +1160,7 @@
           <w:sz w:val="18"/>
         </w:rPr>
         <w:br/>
-        <w:t xml:space="preserve">                                cantidad, precio_unitario, descuento, costo_envio, total)</w:t>
+        <w:t xml:space="preserve">    conn.execute(text("""</w:t>
       </w:r>
       <w:r>
         <w:rPr>
@@ -1077,7 +1169,7 @@
           <w:sz w:val="18"/>
         </w:rPr>
         <w:br/>
-        <w:t xml:space="preserve">        VALUES (:id_fecha,:id_producto,:id_cliente,</w:t>
+        <w:t xml:space="preserve">        INSERT INTO fact_ventas (id_fecha, id_producto, id_cliente,</w:t>
       </w:r>
       <w:r>
         <w:rPr>
@@ -1086,7 +1178,33 @@
           <w:sz w:val="18"/>
         </w:rPr>
         <w:br/>
-        <w:t xml:space="preserve">                :cantidad,:precio_unitario,:descuento,:costo_envio,:total)</w:t>
+        <w:t xml:space="preserve">                                cantidad, precio_unitario, descuento, costo_envio, total)</w:t>
+      </w:r>
+      <w:r>
+        <w:rPr>
+          <w:rFonts w:ascii="Courier New" w:hAnsi="Courier New"/>
+          <w:color w:val="1B5E20"/>
+          <w:sz w:val="18"/>
+        </w:rPr>
+        <w:br/>
+        <w:t xml:space="preserve">        VALUES (:id_fecha,:id_producto,:id_cliente,</w:t>
+      </w:r>
+      <w:r>
+        <w:rPr>
+          <w:rFonts w:ascii="Courier New" w:hAnsi="Courier New"/>
+          <w:color w:val="1B5E20"/>
+          <w:sz w:val="18"/>
+        </w:rPr>
+        <w:br/>
+        <w:t xml:space="preserve">                :cantidad,:precio_</w:t>
+      </w:r>
+      <w:r>
+        <w:rPr>
+          <w:rFonts w:ascii="Courier New" w:hAnsi="Courier New"/>
+          <w:color w:val="1B5E20"/>
+          <w:sz w:val="18"/>
+        </w:rPr>
+        <w:t>unitario,:descuento,:costo_envio,:total)</w:t>
       </w:r>
       <w:r>
         <w:rPr>
@@ -1107,7 +1225,30 @@
           <w:i/>
           <w:color w:val="37474F"/>
         </w:rPr>
-        <w:t>Buenas prácticas aplicadas: uso de ON CONFLICT para idempotencia, transacción atómica con engine.begin(), credenciales externalizadas en .env (nunca hardcodeadas), y dropna() como validación final antes de insertar en hechos.</w:t>
+        <w:t xml:space="preserve">Buenas prácticas aplicadas: uso de ON CONFLICT para idempotencia, transacción atómica con </w:t>
+      </w:r>
+      <w:proofErr w:type="gramStart"/>
+      <w:r>
+        <w:rPr>
+          <w:i/>
+          <w:color w:val="37474F"/>
+        </w:rPr>
+        <w:t>engine.begin</w:t>
+      </w:r>
+      <w:proofErr w:type="gramEnd"/>
+      <w:r>
+        <w:rPr>
+          <w:i/>
+          <w:color w:val="37474F"/>
+        </w:rPr>
+        <w:t xml:space="preserve">(), credenciales externalizadas en .env (nunca </w:t>
+      </w:r>
+      <w:r>
+        <w:rPr>
+          <w:i/>
+          <w:color w:val="37474F"/>
+        </w:rPr>
+        <w:t>hardcodeadas), y dropna() como validación final antes de insertar en hechos.</w:t>
       </w:r>
     </w:p>
     <w:p>
@@ -1130,9 +1271,9 @@
         <w:tblLook w:val="04A0" w:firstRow="1" w:lastRow="0" w:firstColumn="1" w:lastColumn="0" w:noHBand="0" w:noVBand="1"/>
       </w:tblPr>
       <w:tblGrid>
-        <w:gridCol w:w="3041"/>
-        <w:gridCol w:w="3041"/>
-        <w:gridCol w:w="3041"/>
+        <w:gridCol w:w="3037"/>
+        <w:gridCol w:w="3038"/>
+        <w:gridCol w:w="3037"/>
       </w:tblGrid>
       <w:tr>
         <w:tc>
@@ -1235,7 +1376,23 @@
                 <w:color w:val="37474F"/>
                 <w:sz w:val="20"/>
               </w:rPr>
-              <w:t>Ecosistema de datos maduro, Pandas para 2M+ filas</w:t>
+              <w:t xml:space="preserve">Ecosistema de datos maduro, </w:t>
+            </w:r>
+            <w:proofErr w:type="gramStart"/>
+            <w:r>
+              <w:rPr>
+                <w:color w:val="37474F"/>
+                <w:sz w:val="20"/>
+              </w:rPr>
+              <w:t>Pandas</w:t>
+            </w:r>
+            <w:proofErr w:type="gramEnd"/>
+            <w:r>
+              <w:rPr>
+                <w:color w:val="37474F"/>
+                <w:sz w:val="20"/>
+              </w:rPr>
+              <w:t xml:space="preserve"> para 2M+ filas</w:t>
             </w:r>
           </w:p>
         </w:tc>
@@ -1282,7 +1439,14 @@
                 <w:color w:val="37474F"/>
                 <w:sz w:val="20"/>
               </w:rPr>
-              <w:t>API vectorizada, alto rendimiento sin SQL</w:t>
+              <w:t xml:space="preserve">API </w:t>
+            </w:r>
+            <w:r>
+              <w:rPr>
+                <w:color w:val="37474F"/>
+                <w:sz w:val="20"/>
+              </w:rPr>
+              <w:t>vectorizada, alto rendimiento sin SQL</w:t>
             </w:r>
           </w:p>
         </w:tc>
@@ -1590,8 +1754,8 @@
         <w:tblLook w:val="04A0" w:firstRow="1" w:lastRow="0" w:firstColumn="1" w:lastColumn="0" w:noHBand="0" w:noVBand="1"/>
       </w:tblPr>
       <w:tblGrid>
-        <w:gridCol w:w="4561"/>
-        <w:gridCol w:w="4561"/>
+        <w:gridCol w:w="4556"/>
+        <w:gridCol w:w="4556"/>
       </w:tblGrid>
       <w:tr>
         <w:tc>
@@ -1874,7 +2038,14 @@
           <w:sz w:val="36"/>
         </w:rPr>
         <w:lastRenderedPageBreak/>
-        <w:t>EVIDENCIA 2 — Instructivo de Uso (Manual de Usuario)</w:t>
+        <w:t xml:space="preserve">EVIDENCIA 2 — Instructivo de Uso </w:t>
+      </w:r>
+      <w:r>
+        <w:rPr>
+          <w:color w:val="1A237E"/>
+          <w:sz w:val="36"/>
+        </w:rPr>
+        <w:t>(Manual de Usuario)</w:t>
       </w:r>
     </w:p>
     <w:p>
@@ -1903,9 +2074,9 @@
         <w:tblLook w:val="04A0" w:firstRow="1" w:lastRow="0" w:firstColumn="1" w:lastColumn="0" w:noHBand="0" w:noVBand="1"/>
       </w:tblPr>
       <w:tblGrid>
-        <w:gridCol w:w="3041"/>
-        <w:gridCol w:w="3041"/>
-        <w:gridCol w:w="3041"/>
+        <w:gridCol w:w="3037"/>
+        <w:gridCol w:w="3037"/>
+        <w:gridCol w:w="3038"/>
       </w:tblGrid>
       <w:tr>
         <w:tc>
@@ -2251,7 +2422,30 @@
           <w:b/>
           <w:color w:val="37474F"/>
         </w:rPr>
-        <w:t>Paso 2 — Configurar el archivo .env en la raíz del proyecto:</w:t>
+        <w:t xml:space="preserve">Paso 2 — Configurar el </w:t>
+      </w:r>
+      <w:proofErr w:type="gramStart"/>
+      <w:r>
+        <w:rPr>
+          <w:b/>
+          <w:color w:val="37474F"/>
+        </w:rPr>
+        <w:t>archivo .env</w:t>
+      </w:r>
+      <w:proofErr w:type="gramEnd"/>
+      <w:r>
+        <w:rPr>
+          <w:b/>
+          <w:color w:val="37474F"/>
+        </w:rPr>
+        <w:t xml:space="preserve"> en la raíz del </w:t>
+      </w:r>
+      <w:r>
+        <w:rPr>
+          <w:b/>
+          <w:color w:val="37474F"/>
+        </w:rPr>
+        <w:t>proyecto:</w:t>
       </w:r>
     </w:p>
     <w:p>
@@ -2591,15 +2785,39 @@
           <w:sz w:val="18"/>
         </w:rPr>
         <w:br/>
-        <w:t>Index(['fecha', 'year', 'month', 'year_month', 'producto', 'tipo_producto',</w:t>
-      </w:r>
+      </w:r>
+      <w:proofErr w:type="gramStart"/>
       <w:r>
         <w:rPr>
           <w:rFonts w:ascii="Courier New" w:hAnsi="Courier New"/>
           <w:color w:val="1B5E20"/>
           <w:sz w:val="18"/>
         </w:rPr>
+        <w:t>Index(</w:t>
+      </w:r>
+      <w:proofErr w:type="gramEnd"/>
+      <w:r>
+        <w:rPr>
+          <w:rFonts w:ascii="Courier New" w:hAnsi="Courier New"/>
+          <w:color w:val="1B5E20"/>
+          <w:sz w:val="18"/>
+        </w:rPr>
+        <w:t>['fecha', 'year', 'month', 'year_month', 'producto', 'tipo_producto',</w:t>
+      </w:r>
+      <w:r>
+        <w:rPr>
+          <w:rFonts w:ascii="Courier New" w:hAnsi="Courier New"/>
+          <w:color w:val="1B5E20"/>
+          <w:sz w:val="18"/>
+        </w:rPr>
         <w:br/>
+      </w:r>
+      <w:r>
+        <w:rPr>
+          <w:rFonts w:ascii="Courier New" w:hAnsi="Courier New"/>
+          <w:color w:val="1B5E20"/>
+          <w:sz w:val="18"/>
+        </w:rPr>
         <w:t xml:space="preserve">       'cantidad', 'precio_unitario', 'descuento', 'costo_envio', 'total',</w:t>
       </w:r>
       <w:r>
@@ -2680,9 +2898,9 @@
         <w:tblLook w:val="04A0" w:firstRow="1" w:lastRow="0" w:firstColumn="1" w:lastColumn="0" w:noHBand="0" w:noVBand="1"/>
       </w:tblPr>
       <w:tblGrid>
-        <w:gridCol w:w="3041"/>
-        <w:gridCol w:w="3041"/>
-        <w:gridCol w:w="3041"/>
+        <w:gridCol w:w="3039"/>
+        <w:gridCol w:w="3036"/>
+        <w:gridCol w:w="3037"/>
       </w:tblGrid>
       <w:tr>
         <w:tc>
@@ -2802,7 +3020,14 @@
                 <w:color w:val="37474F"/>
                 <w:sz w:val="20"/>
               </w:rPr>
-              <w:t>OperationalError: could not connect</w:t>
+              <w:t xml:space="preserve">OperationalError: could not </w:t>
+            </w:r>
+            <w:r>
+              <w:rPr>
+                <w:color w:val="37474F"/>
+                <w:sz w:val="20"/>
+              </w:rPr>
+              <w:t>connect</w:t>
             </w:r>
           </w:p>
         </w:tc>
@@ -2817,7 +3042,23 @@
                 <w:color w:val="37474F"/>
                 <w:sz w:val="20"/>
               </w:rPr>
-              <w:t>PostgreSQL no activo o .env incorrecto</w:t>
+              <w:t xml:space="preserve">PostgreSQL no activo </w:t>
+            </w:r>
+            <w:proofErr w:type="gramStart"/>
+            <w:r>
+              <w:rPr>
+                <w:color w:val="37474F"/>
+                <w:sz w:val="20"/>
+              </w:rPr>
+              <w:t>o .env</w:t>
+            </w:r>
+            <w:proofErr w:type="gramEnd"/>
+            <w:r>
+              <w:rPr>
+                <w:color w:val="37474F"/>
+                <w:sz w:val="20"/>
+              </w:rPr>
+              <w:t xml:space="preserve"> incorrecto</w:t>
             </w:r>
           </w:p>
         </w:tc>
@@ -2832,8 +3073,17 @@
                 <w:color w:val="37474F"/>
                 <w:sz w:val="20"/>
               </w:rPr>
-              <w:t>Revisar servicio y archivo .env</w:t>
+              <w:t xml:space="preserve">Revisar servicio y </w:t>
             </w:r>
+            <w:proofErr w:type="gramStart"/>
+            <w:r>
+              <w:rPr>
+                <w:color w:val="37474F"/>
+                <w:sz w:val="20"/>
+              </w:rPr>
+              <w:t>archivo .env</w:t>
+            </w:r>
+            <w:proofErr w:type="gramEnd"/>
           </w:p>
         </w:tc>
       </w:tr>
@@ -2926,7 +3176,14 @@
                 <w:color w:val="37474F"/>
                 <w:sz w:val="20"/>
               </w:rPr>
-              <w:t>Abrir index.html desde su carpeta portal/</w:t>
+              <w:t xml:space="preserve">Abrir </w:t>
+            </w:r>
+            <w:r>
+              <w:rPr>
+                <w:color w:val="37474F"/>
+                <w:sz w:val="20"/>
+              </w:rPr>
+              <w:t>index.html desde su carpeta portal/</w:t>
             </w:r>
           </w:p>
         </w:tc>
@@ -2990,10 +3247,10 @@
           <w:noProof/>
         </w:rPr>
         <w:drawing>
-          <wp:inline distT="0" distB="0" distL="0" distR="0" wp14:anchorId="516C5111" wp14:editId="436ED650">
-            <wp:extent cx="5029200" cy="2819400"/>
+          <wp:inline distT="0" distB="0" distL="0" distR="0" wp14:anchorId="5947DE83" wp14:editId="12F39B4F">
+            <wp:extent cx="5792470" cy="3241675"/>
             <wp:effectExtent l="0" t="0" r="0" b="0"/>
-            <wp:docPr id="1" name="Picture 1"/>
+            <wp:docPr id="5" name="Imagen 5" descr="Interfaz de usuario gráfica&#10;&#10;El contenido generado por IA puede ser incorrecto."/>
             <wp:cNvGraphicFramePr>
               <a:graphicFrameLocks xmlns:a="http://schemas.openxmlformats.org/drawingml/2006/main" noChangeAspect="1"/>
             </wp:cNvGraphicFramePr>
@@ -3001,7 +3258,7 @@
               <a:graphicData uri="http://schemas.openxmlformats.org/drawingml/2006/picture">
                 <pic:pic xmlns:pic="http://schemas.openxmlformats.org/drawingml/2006/picture">
                   <pic:nvPicPr>
-                    <pic:cNvPr id="0" name="Dashboard.png"/>
+                    <pic:cNvPr id="5" name="Imagen 5" descr="Interfaz de usuario gráfica&#10;&#10;El contenido generado por IA puede ser incorrecto."/>
                     <pic:cNvPicPr/>
                   </pic:nvPicPr>
                   <pic:blipFill>
@@ -3013,7 +3270,7 @@
                   <pic:spPr>
                     <a:xfrm>
                       <a:off x="0" y="0"/>
-                      <a:ext cx="5029200" cy="2819400"/>
+                      <a:ext cx="5792470" cy="3241675"/>
                     </a:xfrm>
                     <a:prstGeom prst="rect">
                       <a:avLst/>
@@ -3062,10 +3319,10 @@
           <w:noProof/>
         </w:rPr>
         <w:drawing>
-          <wp:inline distT="0" distB="0" distL="0" distR="0" wp14:anchorId="0E208C70" wp14:editId="11B86235">
-            <wp:extent cx="5029200" cy="7981736"/>
+          <wp:inline distT="0" distB="0" distL="0" distR="0" wp14:anchorId="70E1728C" wp14:editId="3BD3C800">
+            <wp:extent cx="3867690" cy="6115904"/>
             <wp:effectExtent l="0" t="0" r="0" b="0"/>
-            <wp:docPr id="2" name="Picture 2"/>
+            <wp:docPr id="6" name="Imagen 6" descr="Interfaz de usuario gráfica&#10;&#10;El contenido generado por IA puede ser incorrecto."/>
             <wp:cNvGraphicFramePr>
               <a:graphicFrameLocks xmlns:a="http://schemas.openxmlformats.org/drawingml/2006/main" noChangeAspect="1"/>
             </wp:cNvGraphicFramePr>
@@ -3073,7 +3330,7 @@
               <a:graphicData uri="http://schemas.openxmlformats.org/drawingml/2006/picture">
                 <pic:pic xmlns:pic="http://schemas.openxmlformats.org/drawingml/2006/picture">
                   <pic:nvPicPr>
-                    <pic:cNvPr id="0" name="Top5.png"/>
+                    <pic:cNvPr id="6" name="Imagen 6" descr="Interfaz de usuario gráfica&#10;&#10;El contenido generado por IA puede ser incorrecto."/>
                     <pic:cNvPicPr/>
                   </pic:nvPicPr>
                   <pic:blipFill>
@@ -3085,7 +3342,7 @@
                   <pic:spPr>
                     <a:xfrm>
                       <a:off x="0" y="0"/>
-                      <a:ext cx="5029200" cy="7981736"/>
+                      <a:ext cx="3867690" cy="6115904"/>
                     </a:xfrm>
                     <a:prstGeom prst="rect">
                       <a:avLst/>
@@ -3109,8 +3366,15 @@
           <w:color w:val="616161"/>
           <w:sz w:val="18"/>
         </w:rPr>
-        <w:lastRenderedPageBreak/>
-        <w:t>Figura 9 – Dashboard Power BI: Ranking Top 5 Productos y Segmentos</w:t>
+        <w:t xml:space="preserve">Figura 9 – Dashboard Power BI: Ranking Top 5 </w:t>
+      </w:r>
+      <w:r>
+        <w:rPr>
+          <w:i/>
+          <w:color w:val="616161"/>
+          <w:sz w:val="18"/>
+        </w:rPr>
+        <w:t>Productos y Segmentos</w:t>
       </w:r>
     </w:p>
     <w:p>
@@ -3122,6 +3386,7 @@
           <w:color w:val="1A237E"/>
           <w:sz w:val="28"/>
         </w:rPr>
+        <w:lastRenderedPageBreak/>
         <w:t>3.3 Dashboard Power BI — Tendencia Temporal</w:t>
       </w:r>
     </w:p>
@@ -3134,10 +3399,10 @@
           <w:noProof/>
         </w:rPr>
         <w:drawing>
-          <wp:inline distT="0" distB="0" distL="0" distR="0" wp14:anchorId="699C4399" wp14:editId="2ADA3533">
-            <wp:extent cx="5029200" cy="2861441"/>
+          <wp:inline distT="0" distB="0" distL="0" distR="0" wp14:anchorId="37C2BFF8" wp14:editId="46498830">
+            <wp:extent cx="4572638" cy="2896004"/>
             <wp:effectExtent l="0" t="0" r="0" b="0"/>
-            <wp:docPr id="3" name="Picture 3"/>
+            <wp:docPr id="7" name="Imagen 7" descr="Gráfico&#10;&#10;El contenido generado por IA puede ser incorrecto."/>
             <wp:cNvGraphicFramePr>
               <a:graphicFrameLocks xmlns:a="http://schemas.openxmlformats.org/drawingml/2006/main" noChangeAspect="1"/>
             </wp:cNvGraphicFramePr>
@@ -3145,7 +3410,7 @@
               <a:graphicData uri="http://schemas.openxmlformats.org/drawingml/2006/picture">
                 <pic:pic xmlns:pic="http://schemas.openxmlformats.org/drawingml/2006/picture">
                   <pic:nvPicPr>
-                    <pic:cNvPr id="0" name="Tendencia temporal.png"/>
+                    <pic:cNvPr id="7" name="Imagen 7" descr="Gráfico&#10;&#10;El contenido generado por IA puede ser incorrecto."/>
                     <pic:cNvPicPr/>
                   </pic:nvPicPr>
                   <pic:blipFill>
@@ -3157,7 +3422,7 @@
                   <pic:spPr>
                     <a:xfrm>
                       <a:off x="0" y="0"/>
-                      <a:ext cx="5029200" cy="2861441"/>
+                      <a:ext cx="4572638" cy="2896004"/>
                     </a:xfrm>
                     <a:prstGeom prst="rect">
                       <a:avLst/>
@@ -3205,10 +3470,10 @@
           <w:noProof/>
         </w:rPr>
         <w:drawing>
-          <wp:inline distT="0" distB="0" distL="0" distR="0" wp14:anchorId="1037BF98" wp14:editId="45BDEA6F">
-            <wp:extent cx="5029200" cy="3889989"/>
+          <wp:inline distT="0" distB="0" distL="0" distR="0" wp14:anchorId="6067A89D" wp14:editId="49C261DE">
+            <wp:extent cx="3505200" cy="3562350"/>
             <wp:effectExtent l="0" t="0" r="0" b="0"/>
-            <wp:docPr id="4" name="Picture 4"/>
+            <wp:docPr id="8" name="Imagen 8" descr="Interfaz de usuario gráfica, Gráfico, Aplicación, Gráfico circular&#10;&#10;El contenido generado por IA puede ser incorrecto."/>
             <wp:cNvGraphicFramePr>
               <a:graphicFrameLocks xmlns:a="http://schemas.openxmlformats.org/drawingml/2006/main" noChangeAspect="1"/>
             </wp:cNvGraphicFramePr>
@@ -3216,7 +3481,7 @@
               <a:graphicData uri="http://schemas.openxmlformats.org/drawingml/2006/picture">
                 <pic:pic xmlns:pic="http://schemas.openxmlformats.org/drawingml/2006/picture">
                   <pic:nvPicPr>
-                    <pic:cNvPr id="0" name="Participación por categoía.png"/>
+                    <pic:cNvPr id="8" name="Imagen 8" descr="Interfaz de usuario gráfica, Gráfico, Aplicación, Gráfico circular&#10;&#10;El contenido generado por IA puede ser incorrecto."/>
                     <pic:cNvPicPr/>
                   </pic:nvPicPr>
                   <pic:blipFill>
@@ -3228,7 +3493,7 @@
                   <pic:spPr>
                     <a:xfrm>
                       <a:off x="0" y="0"/>
-                      <a:ext cx="5029200" cy="3889989"/>
+                      <a:ext cx="3505689" cy="3562847"/>
                     </a:xfrm>
                     <a:prstGeom prst="rect">
                       <a:avLst/>
@@ -3252,8 +3517,15 @@
           <w:color w:val="616161"/>
           <w:sz w:val="18"/>
         </w:rPr>
-        <w:lastRenderedPageBreak/>
-        <w:t>Figura 11 – Dashboard Power BI: Market Share por Tipo de Producto</w:t>
+        <w:t xml:space="preserve">Figura 11 – Dashboard Power BI: Market Share por Tipo de </w:t>
+      </w:r>
+      <w:r>
+        <w:rPr>
+          <w:i/>
+          <w:color w:val="616161"/>
+          <w:sz w:val="18"/>
+        </w:rPr>
+        <w:t>Producto</w:t>
       </w:r>
     </w:p>
     <w:p>
@@ -3265,6 +3537,7 @@
           <w:color w:val="1A237E"/>
           <w:sz w:val="28"/>
         </w:rPr>
+        <w:lastRenderedPageBreak/>
         <w:t>3.5 Resumen de Funcionalidades Implementadas</w:t>
       </w:r>
     </w:p>
@@ -3275,9 +3548,9 @@
         <w:tblLook w:val="04A0" w:firstRow="1" w:lastRow="0" w:firstColumn="1" w:lastColumn="0" w:noHBand="0" w:noVBand="1"/>
       </w:tblPr>
       <w:tblGrid>
-        <w:gridCol w:w="3041"/>
-        <w:gridCol w:w="3041"/>
-        <w:gridCol w:w="3041"/>
+        <w:gridCol w:w="3039"/>
+        <w:gridCol w:w="3036"/>
+        <w:gridCol w:w="3037"/>
       </w:tblGrid>
       <w:tr>
         <w:tc>
@@ -3365,7 +3638,14 @@
                 <w:color w:val="37474F"/>
                 <w:sz w:val="20"/>
               </w:rPr>
-              <w:t>✅ Funcional</w:t>
+              <w:t>✅</w:t>
+            </w:r>
+            <w:r>
+              <w:rPr>
+                <w:color w:val="37474F"/>
+                <w:sz w:val="20"/>
+              </w:rPr>
+              <w:t xml:space="preserve"> Funcional</w:t>
             </w:r>
           </w:p>
         </w:tc>
@@ -3412,7 +3692,14 @@
                 <w:color w:val="37474F"/>
                 <w:sz w:val="20"/>
               </w:rPr>
-              <w:t>✅ Funcional</w:t>
+              <w:t>✅</w:t>
+            </w:r>
+            <w:r>
+              <w:rPr>
+                <w:color w:val="37474F"/>
+                <w:sz w:val="20"/>
+              </w:rPr>
+              <w:t xml:space="preserve"> Funcional</w:t>
             </w:r>
           </w:p>
         </w:tc>
@@ -3459,7 +3746,14 @@
                 <w:color w:val="37474F"/>
                 <w:sz w:val="20"/>
               </w:rPr>
-              <w:t>✅ Completo</w:t>
+              <w:t>✅</w:t>
+            </w:r>
+            <w:r>
+              <w:rPr>
+                <w:color w:val="37474F"/>
+                <w:sz w:val="20"/>
+              </w:rPr>
+              <w:t xml:space="preserve"> Completo</w:t>
             </w:r>
           </w:p>
         </w:tc>
@@ -3474,7 +3768,14 @@
                 <w:color w:val="37474F"/>
                 <w:sz w:val="20"/>
               </w:rPr>
-              <w:t>DDL con constraints, FK e índices de performance</w:t>
+              <w:t xml:space="preserve">DDL </w:t>
+            </w:r>
+            <w:r>
+              <w:rPr>
+                <w:color w:val="37474F"/>
+                <w:sz w:val="20"/>
+              </w:rPr>
+              <w:t>con constraints, FK e índices de performance</w:t>
             </w:r>
           </w:p>
         </w:tc>
@@ -3506,7 +3807,14 @@
                 <w:color w:val="37474F"/>
                 <w:sz w:val="20"/>
               </w:rPr>
-              <w:t>✅ Funcional</w:t>
+              <w:t>✅</w:t>
+            </w:r>
+            <w:r>
+              <w:rPr>
+                <w:color w:val="37474F"/>
+                <w:sz w:val="20"/>
+              </w:rPr>
+              <w:t xml:space="preserve"> Funcional</w:t>
             </w:r>
           </w:p>
         </w:tc>
@@ -3553,7 +3861,14 @@
                 <w:color w:val="37474F"/>
                 <w:sz w:val="20"/>
               </w:rPr>
-              <w:t>✅ Completo</w:t>
+              <w:t>✅</w:t>
+            </w:r>
+            <w:r>
+              <w:rPr>
+                <w:color w:val="37474F"/>
+                <w:sz w:val="20"/>
+              </w:rPr>
+              <w:t xml:space="preserve"> Completo</w:t>
             </w:r>
           </w:p>
         </w:tc>
@@ -3600,7 +3915,14 @@
                 <w:color w:val="37474F"/>
                 <w:sz w:val="20"/>
               </w:rPr>
-              <w:t>✅ Completo</w:t>
+              <w:t>✅</w:t>
+            </w:r>
+            <w:r>
+              <w:rPr>
+                <w:color w:val="37474F"/>
+                <w:sz w:val="20"/>
+              </w:rPr>
+              <w:t xml:space="preserve"> Completo</w:t>
             </w:r>
           </w:p>
         </w:tc>
@@ -3627,6 +3949,7 @@
             <w:shd w:val="clear" w:color="auto" w:fill="E3F2FD"/>
           </w:tcPr>
           <w:p>
+            <w:proofErr w:type="gramStart"/>
             <w:r>
               <w:rPr>
                 <w:color w:val="37474F"/>
@@ -3634,6 +3957,7 @@
               </w:rPr>
               <w:t>.env</w:t>
             </w:r>
+            <w:proofErr w:type="gramEnd"/>
           </w:p>
         </w:tc>
         <w:tc>
@@ -3647,7 +3971,14 @@
                 <w:color w:val="37474F"/>
                 <w:sz w:val="20"/>
               </w:rPr>
-              <w:t>✅ Seguro</w:t>
+              <w:t>✅</w:t>
+            </w:r>
+            <w:r>
+              <w:rPr>
+                <w:color w:val="37474F"/>
+                <w:sz w:val="20"/>
+              </w:rPr>
+              <w:t xml:space="preserve"> Seguro</w:t>
             </w:r>
           </w:p>
         </w:tc>

</xml_diff>